<commit_message>
payslip api and template2
</commit_message>
<xml_diff>
--- a/public/Templates/Payslip1.docx
+++ b/public/Templates/Payslip1.docx
@@ -15,7 +15,6 @@
       </w:pPr>
       <w:bookmarkStart w:id="0" w:name="_soydgc1zxqv6" w:colFirst="0" w:colLast="0"/>
       <w:bookmarkEnd w:id="0"/>
-      <w:proofErr w:type="spellStart"/>
       <w:r>
         <w:rPr>
           <w:rFonts w:ascii="Abadi Extra Light" w:hAnsi="Abadi Extra Light"/>
@@ -25,7 +24,6 @@
         </w:rPr>
         <w:t>Payslip</w:t>
       </w:r>
-      <w:proofErr w:type="spellEnd"/>
     </w:p>
     <w:p>
       <w:pPr>
@@ -36,29 +34,13 @@
         <w:rPr>
           <w:b/>
         </w:rPr>
-        <w:t xml:space="preserve">Pay </w:t>
-      </w:r>
-      <w:proofErr w:type="gramStart"/>
-      <w:r>
-        <w:rPr>
-          <w:b/>
-        </w:rPr>
-        <w:t>Period</w:t>
+        <w:t>Pay Period</w:t>
       </w:r>
       <w:r>
         <w:t xml:space="preserve">: </w:t>
       </w:r>
       <w:r>
-        <w:t>{</w:t>
-      </w:r>
-      <w:proofErr w:type="spellStart"/>
-      <w:proofErr w:type="gramEnd"/>
-      <w:r>
-        <w:t>PayslipDate</w:t>
-      </w:r>
-      <w:proofErr w:type="spellEnd"/>
-      <w:r>
-        <w:t>}</w:t>
+        <w:t>{PayslipDate}</w:t>
       </w:r>
     </w:p>
     <w:p>
@@ -71,7 +53,6 @@
         </w:rPr>
         <w:t xml:space="preserve">Employee </w:t>
       </w:r>
-      <w:proofErr w:type="gramStart"/>
       <w:r>
         <w:rPr>
           <w:b/>
@@ -79,16 +60,7 @@
         <w:t>Name:</w:t>
       </w:r>
       <w:r>
-        <w:t xml:space="preserve"> {</w:t>
-      </w:r>
-      <w:proofErr w:type="spellStart"/>
-      <w:proofErr w:type="gramEnd"/>
-      <w:r>
-        <w:t>EMPNameSurname</w:t>
-      </w:r>
-      <w:proofErr w:type="spellEnd"/>
-      <w:r>
-        <w:t>}</w:t>
+        <w:t xml:space="preserve"> {EMPNameSurname}</w:t>
       </w:r>
     </w:p>
     <w:p>
@@ -101,7 +73,6 @@
         </w:rPr>
         <w:t xml:space="preserve">Employee </w:t>
       </w:r>
-      <w:proofErr w:type="gramStart"/>
       <w:r>
         <w:rPr>
           <w:b/>
@@ -118,16 +89,7 @@
         <w:t xml:space="preserve"> </w:t>
       </w:r>
       <w:r>
-        <w:t>{</w:t>
-      </w:r>
-      <w:proofErr w:type="spellStart"/>
-      <w:proofErr w:type="gramEnd"/>
-      <w:r>
-        <w:t>EMPNumber</w:t>
-      </w:r>
-      <w:proofErr w:type="spellEnd"/>
-      <w:r>
-        <w:t>}</w:t>
+        <w:t>{EMPNumber}</w:t>
       </w:r>
     </w:p>
     <w:p>
@@ -150,14 +112,19 @@
         <w:rPr>
           <w:bCs/>
         </w:rPr>
-        <w:t>{</w:t>
-      </w:r>
-      <w:proofErr w:type="spellStart"/>
+        <w:t>{EMPDepartment}</w:t>
+      </w:r>
       <w:r>
         <w:rPr>
           <w:bCs/>
         </w:rPr>
-        <w:t>EMP</w:t>
+        <w:t xml:space="preserve"> </w:t>
+      </w:r>
+      <w:r>
+        <w:rPr>
+          <w:bCs/>
+        </w:rPr>
+        <w:t>{EMP</w:t>
       </w:r>
       <w:r>
         <w:rPr>
@@ -165,27 +132,6 @@
         </w:rPr>
         <w:t>JobTitle</w:t>
       </w:r>
-      <w:proofErr w:type="spellEnd"/>
-      <w:r>
-        <w:rPr>
-          <w:bCs/>
-        </w:rPr>
-        <w:t>}</w:t>
-      </w:r>
-      <w:r>
-        <w:rPr>
-          <w:bCs/>
-        </w:rPr>
-        <w:t xml:space="preserve"> – {</w:t>
-      </w:r>
-      <w:proofErr w:type="spellStart"/>
-      <w:r>
-        <w:rPr>
-          <w:bCs/>
-        </w:rPr>
-        <w:t>EMPDepartment</w:t>
-      </w:r>
-      <w:proofErr w:type="spellEnd"/>
       <w:r>
         <w:rPr>
           <w:bCs/>
@@ -389,23 +335,14 @@
                 <w:sz w:val="20"/>
                 <w:szCs w:val="20"/>
               </w:rPr>
-              <w:t>{</w:t>
-            </w:r>
-            <w:proofErr w:type="spellStart"/>
-            <w:r>
-              <w:rPr>
-                <w:sz w:val="20"/>
-                <w:szCs w:val="20"/>
-              </w:rPr>
-              <w:t>OvertimePay</w:t>
-            </w:r>
-            <w:proofErr w:type="spellEnd"/>
-            <w:r>
-              <w:rPr>
-                <w:sz w:val="20"/>
-                <w:szCs w:val="20"/>
-              </w:rPr>
-              <w:t>}</w:t>
+              <w:t>R</w:t>
+            </w:r>
+            <w:r>
+              <w:rPr>
+                <w:sz w:val="20"/>
+                <w:szCs w:val="20"/>
+              </w:rPr>
+              <w:t>{OvertimePay}</w:t>
             </w:r>
           </w:p>
         </w:tc>
@@ -478,23 +415,14 @@
                 <w:sz w:val="20"/>
                 <w:szCs w:val="20"/>
               </w:rPr>
-              <w:t>{</w:t>
-            </w:r>
-            <w:proofErr w:type="spellStart"/>
-            <w:r>
-              <w:rPr>
-                <w:sz w:val="20"/>
-                <w:szCs w:val="20"/>
-              </w:rPr>
-              <w:t>BonusSalary</w:t>
-            </w:r>
-            <w:proofErr w:type="spellEnd"/>
-            <w:r>
-              <w:rPr>
-                <w:sz w:val="20"/>
-                <w:szCs w:val="20"/>
-              </w:rPr>
-              <w:t>}</w:t>
+              <w:t>R</w:t>
+            </w:r>
+            <w:r>
+              <w:rPr>
+                <w:sz w:val="20"/>
+                <w:szCs w:val="20"/>
+              </w:rPr>
+              <w:t>{BonusSalary}</w:t>
             </w:r>
           </w:p>
         </w:tc>
@@ -567,23 +495,14 @@
                 <w:sz w:val="20"/>
                 <w:szCs w:val="20"/>
               </w:rPr>
-              <w:t>{</w:t>
-            </w:r>
-            <w:proofErr w:type="spellStart"/>
-            <w:r>
-              <w:rPr>
-                <w:sz w:val="20"/>
-                <w:szCs w:val="20"/>
-              </w:rPr>
-              <w:t>GrossSalary</w:t>
-            </w:r>
-            <w:proofErr w:type="spellEnd"/>
-            <w:r>
-              <w:rPr>
-                <w:sz w:val="20"/>
-                <w:szCs w:val="20"/>
-              </w:rPr>
-              <w:t>}</w:t>
+              <w:t>R</w:t>
+            </w:r>
+            <w:r>
+              <w:rPr>
+                <w:sz w:val="20"/>
+                <w:szCs w:val="20"/>
+              </w:rPr>
+              <w:t>{GrossSalary}</w:t>
             </w:r>
           </w:p>
         </w:tc>
@@ -780,23 +699,14 @@
                 <w:sz w:val="20"/>
                 <w:szCs w:val="20"/>
               </w:rPr>
-              <w:t>{</w:t>
-            </w:r>
-            <w:proofErr w:type="spellStart"/>
-            <w:r>
-              <w:rPr>
-                <w:sz w:val="20"/>
-                <w:szCs w:val="20"/>
-              </w:rPr>
-              <w:t>EmpTaxAmount</w:t>
-            </w:r>
-            <w:proofErr w:type="spellEnd"/>
-            <w:r>
-              <w:rPr>
-                <w:sz w:val="20"/>
-                <w:szCs w:val="20"/>
-              </w:rPr>
-              <w:t>}</w:t>
+              <w:t>R</w:t>
+            </w:r>
+            <w:r>
+              <w:rPr>
+                <w:sz w:val="20"/>
+                <w:szCs w:val="20"/>
+              </w:rPr>
+              <w:t>{EmpTaxAmount}</w:t>
             </w:r>
           </w:p>
         </w:tc>
@@ -869,23 +779,14 @@
                 <w:sz w:val="20"/>
                 <w:szCs w:val="20"/>
               </w:rPr>
-              <w:t>{</w:t>
-            </w:r>
-            <w:proofErr w:type="spellStart"/>
-            <w:r>
-              <w:rPr>
-                <w:sz w:val="20"/>
-                <w:szCs w:val="20"/>
-              </w:rPr>
-              <w:t>CompMedicalAid</w:t>
-            </w:r>
-            <w:proofErr w:type="spellEnd"/>
-            <w:r>
-              <w:rPr>
-                <w:sz w:val="20"/>
-                <w:szCs w:val="20"/>
-              </w:rPr>
-              <w:t>}</w:t>
+              <w:t>R</w:t>
+            </w:r>
+            <w:r>
+              <w:rPr>
+                <w:sz w:val="20"/>
+                <w:szCs w:val="20"/>
+              </w:rPr>
+              <w:t>{CompMedicalAid}</w:t>
             </w:r>
           </w:p>
         </w:tc>
@@ -958,23 +859,14 @@
                 <w:sz w:val="20"/>
                 <w:szCs w:val="20"/>
               </w:rPr>
-              <w:t>{</w:t>
-            </w:r>
-            <w:proofErr w:type="spellStart"/>
-            <w:r>
-              <w:rPr>
-                <w:sz w:val="20"/>
-                <w:szCs w:val="20"/>
-              </w:rPr>
-              <w:t>TotalDeductions</w:t>
-            </w:r>
-            <w:proofErr w:type="spellEnd"/>
-            <w:r>
-              <w:rPr>
-                <w:sz w:val="20"/>
-                <w:szCs w:val="20"/>
-              </w:rPr>
-              <w:t>}</w:t>
+              <w:t>R</w:t>
+            </w:r>
+            <w:r>
+              <w:rPr>
+                <w:sz w:val="20"/>
+                <w:szCs w:val="20"/>
+              </w:rPr>
+              <w:t>{TotalDeductions}</w:t>
             </w:r>
           </w:p>
         </w:tc>
@@ -1166,6 +1058,13 @@
                 <w:szCs w:val="20"/>
               </w:rPr>
             </w:pPr>
+            <w:r>
+              <w:rPr>
+                <w:sz w:val="20"/>
+                <w:szCs w:val="20"/>
+              </w:rPr>
+              <w:t>R</w:t>
+            </w:r>
             <w:r>
               <w:rPr>
                 <w:sz w:val="20"/>

</xml_diff>